<commit_message>
Implemented Azure AI search
</commit_message>
<xml_diff>
--- a/data/Claims Process Document.docx
+++ b/data/Claims Process Document.docx
@@ -25,23 +25,7 @@
           <w:b/>
           <w:sz w:val="24"/>
         </w:rPr>
-        <w:t xml:space="preserve">Step 1: </w:t>
-      </w:r>
-      <w:proofErr w:type="gramStart"/>
-      <w:r>
-        <w:rPr>
-          <w:b/>
-          <w:sz w:val="24"/>
-        </w:rPr>
-        <w:t>Report</w:t>
-      </w:r>
-      <w:proofErr w:type="gramEnd"/>
-      <w:r>
-        <w:rPr>
-          <w:b/>
-          <w:sz w:val="24"/>
-        </w:rPr>
-        <w:t xml:space="preserve"> the Incident </w:t>
+        <w:t xml:space="preserve">Step 1: Report the Incident </w:t>
       </w:r>
     </w:p>
     <w:p>
@@ -133,29 +117,19 @@
         <w:rPr>
           <w:sz w:val="24"/>
         </w:rPr>
-        <w:t xml:space="preserve">Supporting documents (photos, receipts, </w:t>
-      </w:r>
-      <w:proofErr w:type="gramStart"/>
-      <w:r>
-        <w:rPr>
-          <w:sz w:val="24"/>
-        </w:rPr>
-        <w:t xml:space="preserve">reports)  </w:t>
-      </w:r>
+        <w:t xml:space="preserve">Supporting documents (photos, receipts, reports)  </w:t>
+      </w:r>
+    </w:p>
+    <w:p>
+      <w:pPr>
+        <w:spacing w:after="5" w:line="410" w:lineRule="auto"/>
+      </w:pPr>
       <w:r>
         <w:rPr>
           <w:b/>
           <w:sz w:val="24"/>
         </w:rPr>
-        <w:t>Step</w:t>
-      </w:r>
-      <w:proofErr w:type="gramEnd"/>
-      <w:r>
-        <w:rPr>
-          <w:b/>
-          <w:sz w:val="24"/>
-        </w:rPr>
-        <w:t xml:space="preserve"> 3: Claim Review </w:t>
+        <w:t xml:space="preserve">Step 3: Claim Review </w:t>
       </w:r>
       <w:r>
         <w:rPr>
@@ -275,19 +249,11 @@
         <w:spacing w:after="250"/>
         <w:ind w:left="-5" w:hanging="10"/>
       </w:pPr>
-      <w:proofErr w:type="gramStart"/>
-      <w:r>
-        <w:rPr>
-          <w:sz w:val="24"/>
-        </w:rPr>
-        <w:t>Typically</w:t>
-      </w:r>
-      <w:proofErr w:type="gramEnd"/>
-      <w:r>
-        <w:rPr>
-          <w:sz w:val="24"/>
-        </w:rPr>
-        <w:t xml:space="preserve"> </w:t>
+      <w:r>
+        <w:rPr>
+          <w:sz w:val="24"/>
+        </w:rPr>
+        <w:t xml:space="preserve">Typically </w:t>
       </w:r>
       <w:r>
         <w:rPr>

</xml_diff>